<commit_message>
feat: add GitHub Actions CI
</commit_message>
<xml_diff>
--- a/Detailed_Documentation.docx
+++ b/Detailed_Documentation.docx
@@ -12715,7 +12715,13 @@
     </w:p>
     <w:p>
       <w:r>
-        <w:t xml:space="preserve">       │</w:t>
+        <w:t xml:space="preserve">      </w:t>
+      </w:r>
+      <w:r>
+        <w:t xml:space="preserve">  </w:t>
+      </w:r>
+      <w:r>
+        <w:t>│</w:t>
       </w:r>
     </w:p>
     <w:p>
@@ -12738,7 +12744,13 @@
     </w:p>
     <w:p>
       <w:r>
-        <w:t xml:space="preserve">       │</w:t>
+        <w:t xml:space="preserve">       </w:t>
+      </w:r>
+      <w:r>
+        <w:t xml:space="preserve"> </w:t>
+      </w:r>
+      <w:r>
+        <w:t>│</w:t>
       </w:r>
     </w:p>
     <w:p>
@@ -14751,6 +14763,771 @@
     <w:p>
       <w:r>
         <w:t>Once your build finishes, we'll continue from there.</w:t>
+      </w:r>
+    </w:p>
+    <w:p>
+      <w:r>
+        <w:br w:type="page"/>
+      </w:r>
+    </w:p>
+    <w:p>
+      <w:r>
+        <w:lastRenderedPageBreak/>
+        <w:t xml:space="preserve">Bro, if you're asking about the </w:t>
+      </w:r>
+      <w:r>
+        <w:rPr>
+          <w:b/>
+          <w:bCs/>
+        </w:rPr>
+        <w:t>next CI/CD layer</w:t>
+      </w:r>
+      <w:r>
+        <w:t>, we're not just adding a random GitHub Actions YAML. The goal is to make your Credit Risk ML Platform behave more like a real engineering project.</w:t>
+      </w:r>
+    </w:p>
+    <w:p>
+      <w:pPr>
+        <w:rPr>
+          <w:b/>
+          <w:bCs/>
+        </w:rPr>
+      </w:pPr>
+      <w:r>
+        <w:rPr>
+          <w:b/>
+          <w:bCs/>
+        </w:rPr>
+        <w:t>What we'll actually build</w:t>
+      </w:r>
+    </w:p>
+    <w:p>
+      <w:r>
+        <w:t>You push code to GitHub</w:t>
+      </w:r>
+    </w:p>
+    <w:p>
+      <w:r>
+        <w:t xml:space="preserve">        ↓</w:t>
+      </w:r>
+    </w:p>
+    <w:p>
+      <w:r>
+        <w:t>GitHub Actions starts automatically</w:t>
+      </w:r>
+    </w:p>
+    <w:p>
+      <w:r>
+        <w:t xml:space="preserve">        ↓</w:t>
+      </w:r>
+    </w:p>
+    <w:p>
+      <w:r>
+        <w:t>┌──────────────────────────────┐</w:t>
+      </w:r>
+    </w:p>
+    <w:p>
+      <w:r>
+        <w:t>│ 1. Set up Python             │</w:t>
+      </w:r>
+    </w:p>
+    <w:p>
+      <w:r>
+        <w:t>│ 2. Install dependencies      │</w:t>
+      </w:r>
+    </w:p>
+    <w:p>
+      <w:r>
+        <w:t xml:space="preserve">│ 3. Run </w:t>
+      </w:r>
+      <w:proofErr w:type="spellStart"/>
+      <w:r>
+        <w:t>pytest</w:t>
+      </w:r>
+      <w:proofErr w:type="spellEnd"/>
+      <w:r>
+        <w:t xml:space="preserve">                │</w:t>
+      </w:r>
+    </w:p>
+    <w:p>
+      <w:r>
+        <w:t>│ 4. Build Docker image        │</w:t>
+      </w:r>
+    </w:p>
+    <w:p>
+      <w:r>
+        <w:t>│ 5. Verify Docker build       │</w:t>
+      </w:r>
+    </w:p>
+    <w:p>
+      <w:r>
+        <w:t>└──────────────────────────────┘</w:t>
+      </w:r>
+    </w:p>
+    <w:p>
+      <w:r>
+        <w:t xml:space="preserve">        ↓</w:t>
+      </w:r>
+    </w:p>
+    <w:p>
+      <w:r>
+        <w:t xml:space="preserve">    </w:t>
+      </w:r>
+      <w:r>
+        <w:rPr>
+          <w:rFonts w:ascii="Segoe UI Emoji" w:hAnsi="Segoe UI Emoji" w:cs="Segoe UI Emoji"/>
+        </w:rPr>
+        <w:t>✅</w:t>
+      </w:r>
+      <w:r>
+        <w:t xml:space="preserve"> Pass </w:t>
+      </w:r>
+      <w:r>
+        <w:rPr>
+          <w:rFonts w:ascii="Aptos" w:hAnsi="Aptos" w:cs="Aptos"/>
+        </w:rPr>
+        <w:t>→</w:t>
+      </w:r>
+      <w:r>
+        <w:t xml:space="preserve"> CI succeeds</w:t>
+      </w:r>
+    </w:p>
+    <w:p>
+      <w:r>
+        <w:t xml:space="preserve">    </w:t>
+      </w:r>
+      <w:r>
+        <w:rPr>
+          <w:rFonts w:ascii="Segoe UI Emoji" w:hAnsi="Segoe UI Emoji" w:cs="Segoe UI Emoji"/>
+        </w:rPr>
+        <w:t>❌</w:t>
+      </w:r>
+      <w:r>
+        <w:t xml:space="preserve"> Fail </w:t>
+      </w:r>
+      <w:r>
+        <w:rPr>
+          <w:rFonts w:ascii="Aptos" w:hAnsi="Aptos" w:cs="Aptos"/>
+        </w:rPr>
+        <w:t>→</w:t>
+      </w:r>
+      <w:r>
+        <w:t xml:space="preserve"> CI fails</w:t>
+      </w:r>
+    </w:p>
+    <w:p>
+      <w:pPr>
+        <w:rPr>
+          <w:b/>
+          <w:bCs/>
+        </w:rPr>
+      </w:pPr>
+      <w:r>
+        <w:rPr>
+          <w:b/>
+          <w:bCs/>
+        </w:rPr>
+        <w:t>Layer 1 — Automated testing</w:t>
+      </w:r>
+    </w:p>
+    <w:p>
+      <w:r>
+        <w:t>Currently you manually run:</w:t>
+      </w:r>
+    </w:p>
+    <w:p>
+      <w:proofErr w:type="spellStart"/>
+      <w:r>
+        <w:t>pytest</w:t>
+      </w:r>
+      <w:proofErr w:type="spellEnd"/>
+    </w:p>
+    <w:p>
+      <w:r>
+        <w:t>We'll make GitHub run it automatically whenever you push code.</w:t>
+      </w:r>
+    </w:p>
+    <w:p>
+      <w:proofErr w:type="gramStart"/>
+      <w:r>
+        <w:t>So</w:t>
+      </w:r>
+      <w:proofErr w:type="gramEnd"/>
+      <w:r>
+        <w:t xml:space="preserve"> if tomorrow you modify engineering.py and accidentally break something:</w:t>
+      </w:r>
+    </w:p>
+    <w:p>
+      <w:r>
+        <w:t>git push</w:t>
+      </w:r>
+    </w:p>
+    <w:p>
+      <w:r>
+        <w:t xml:space="preserve">   ↓</w:t>
+      </w:r>
+    </w:p>
+    <w:p>
+      <w:r>
+        <w:t>GitHub Actions</w:t>
+      </w:r>
+    </w:p>
+    <w:p>
+      <w:r>
+        <w:lastRenderedPageBreak/>
+        <w:t xml:space="preserve">   ↓</w:t>
+      </w:r>
+    </w:p>
+    <w:p>
+      <w:proofErr w:type="spellStart"/>
+      <w:r>
+        <w:t>pytest</w:t>
+      </w:r>
+      <w:proofErr w:type="spellEnd"/>
+    </w:p>
+    <w:p>
+      <w:r>
+        <w:t xml:space="preserve">   ↓</w:t>
+      </w:r>
+    </w:p>
+    <w:p>
+      <w:r>
+        <w:rPr>
+          <w:rFonts w:ascii="Segoe UI Emoji" w:hAnsi="Segoe UI Emoji" w:cs="Segoe UI Emoji"/>
+        </w:rPr>
+        <w:t>❌</w:t>
+      </w:r>
+      <w:r>
+        <w:t xml:space="preserve"> 2 tests failed</w:t>
+      </w:r>
+    </w:p>
+    <w:p>
+      <w:r>
+        <w:t>You immediately know the change broke something.</w:t>
+      </w:r>
+    </w:p>
+    <w:p>
+      <w:r>
+        <w:pict w14:anchorId="35198FB0">
+          <v:rect id="_x0000_i1288" style="width:0;height:1.5pt" o:hralign="center" o:hrstd="t" o:hr="t" fillcolor="#a0a0a0" stroked="f"/>
+        </w:pict>
+      </w:r>
+    </w:p>
+    <w:p>
+      <w:pPr>
+        <w:rPr>
+          <w:b/>
+          <w:bCs/>
+        </w:rPr>
+      </w:pPr>
+      <w:r>
+        <w:rPr>
+          <w:b/>
+          <w:bCs/>
+        </w:rPr>
+        <w:t>Layer 2 — Docker build validation</w:t>
+      </w:r>
+    </w:p>
+    <w:p>
+      <w:r>
+        <w:t>We already know locally that:</w:t>
+      </w:r>
+    </w:p>
+    <w:p>
+      <w:r>
+        <w:t>docker compose build</w:t>
+      </w:r>
+    </w:p>
+    <w:p>
+      <w:r>
+        <w:t>works.</w:t>
+      </w:r>
+    </w:p>
+    <w:p>
+      <w:r>
+        <w:t>We'll make GitHub verify that too.</w:t>
+      </w:r>
+    </w:p>
+    <w:p>
+      <w:r>
+        <w:t>That means your repository isn't just saying:</w:t>
+      </w:r>
+    </w:p>
+    <w:p>
+      <w:r>
+        <w:t xml:space="preserve">"Here's a </w:t>
+      </w:r>
+      <w:proofErr w:type="spellStart"/>
+      <w:r>
+        <w:t>Dockerfile</w:t>
+      </w:r>
+      <w:proofErr w:type="spellEnd"/>
+      <w:r>
+        <w:t>."</w:t>
+      </w:r>
+    </w:p>
+    <w:p>
+      <w:r>
+        <w:t>It is continuously checking:</w:t>
+      </w:r>
+    </w:p>
+    <w:p>
+      <w:r>
+        <w:t>"Can this application actually be packaged into a Docker image?"</w:t>
+      </w:r>
+    </w:p>
+    <w:p>
+      <w:r>
+        <w:pict w14:anchorId="30AA182C">
+          <v:rect id="_x0000_i1289" style="width:0;height:1.5pt" o:hralign="center" o:hrstd="t" o:hr="t" fillcolor="#a0a0a0" stroked="f"/>
+        </w:pict>
+      </w:r>
+    </w:p>
+    <w:p>
+      <w:pPr>
+        <w:rPr>
+          <w:b/>
+          <w:bCs/>
+        </w:rPr>
+      </w:pPr>
+      <w:r>
+        <w:rPr>
+          <w:b/>
+          <w:bCs/>
+        </w:rPr>
+        <w:t>Layer 3 — Code quality</w:t>
+      </w:r>
+    </w:p>
+    <w:p>
+      <w:r>
+        <w:t>We can add something lightweight such as:</w:t>
+      </w:r>
+    </w:p>
+    <w:p>
+      <w:r>
+        <w:t>ruff</w:t>
+      </w:r>
+    </w:p>
+    <w:p>
+      <w:r>
+        <w:t>to catch things like:</w:t>
+      </w:r>
+    </w:p>
+    <w:p>
+      <w:pPr>
+        <w:numPr>
+          <w:ilvl w:val="0"/>
+          <w:numId w:val="9"/>
+        </w:numPr>
+      </w:pPr>
+      <w:r>
+        <w:t>unused imports</w:t>
+      </w:r>
+    </w:p>
+    <w:p>
+      <w:pPr>
+        <w:numPr>
+          <w:ilvl w:val="0"/>
+          <w:numId w:val="9"/>
+        </w:numPr>
+      </w:pPr>
+      <w:r>
+        <w:t>obvious Python mistakes</w:t>
+      </w:r>
+    </w:p>
+    <w:p>
+      <w:pPr>
+        <w:numPr>
+          <w:ilvl w:val="0"/>
+          <w:numId w:val="9"/>
+        </w:numPr>
+      </w:pPr>
+      <w:r>
+        <w:t>formatting issues</w:t>
+      </w:r>
+    </w:p>
+    <w:p>
+      <w:pPr>
+        <w:numPr>
+          <w:ilvl w:val="0"/>
+          <w:numId w:val="9"/>
+        </w:numPr>
+      </w:pPr>
+      <w:r>
+        <w:t>questionable code patterns</w:t>
+      </w:r>
+    </w:p>
+    <w:p>
+      <w:r>
+        <w:t>We don't need to turn this into a giant enterprise pipeline.</w:t>
+      </w:r>
+    </w:p>
+    <w:p>
+      <w:r>
+        <w:pict w14:anchorId="086E2388">
+          <v:rect id="_x0000_i1290" style="width:0;height:1.5pt" o:hralign="center" o:hrstd="t" o:hr="t" fillcolor="#a0a0a0" stroked="f"/>
+        </w:pict>
+      </w:r>
+    </w:p>
+    <w:p>
+      <w:pPr>
+        <w:rPr>
+          <w:b/>
+          <w:bCs/>
+        </w:rPr>
+      </w:pPr>
+      <w:r>
+        <w:rPr>
+          <w:b/>
+          <w:bCs/>
+        </w:rPr>
+        <w:lastRenderedPageBreak/>
+        <w:t>Layer 4 — GitHub Actions status</w:t>
+      </w:r>
+    </w:p>
+    <w:p>
+      <w:r>
+        <w:t>Your GitHub repository will show something like:</w:t>
+      </w:r>
+    </w:p>
+    <w:p>
+      <w:r>
+        <w:t>CI</w:t>
+      </w:r>
+    </w:p>
+    <w:p>
+      <w:r>
+        <w:t>✓ Tests passed</w:t>
+      </w:r>
+    </w:p>
+    <w:p>
+      <w:r>
+        <w:t>✓ Docker build passed</w:t>
+      </w:r>
+    </w:p>
+    <w:p>
+      <w:r>
+        <w:t>That's a surprisingly useful portfolio signal because an interviewer can see that the project isn't just a collection of locally working files.</w:t>
+      </w:r>
+    </w:p>
+    <w:p>
+      <w:r>
+        <w:pict w14:anchorId="0455E031">
+          <v:rect id="_x0000_i1291" style="width:0;height:1.5pt" o:hralign="center" o:hrstd="t" o:hr="t" fillcolor="#a0a0a0" stroked="f"/>
+        </w:pict>
+      </w:r>
+    </w:p>
+    <w:p>
+      <w:pPr>
+        <w:rPr>
+          <w:b/>
+          <w:bCs/>
+        </w:rPr>
+      </w:pPr>
+      <w:r>
+        <w:rPr>
+          <w:b/>
+          <w:bCs/>
+        </w:rPr>
+        <w:t>And importantly: what we are NOT doing yet</w:t>
+      </w:r>
+    </w:p>
+    <w:p>
+      <w:r>
+        <w:t xml:space="preserve">We're </w:t>
+      </w:r>
+      <w:r>
+        <w:rPr>
+          <w:b/>
+          <w:bCs/>
+        </w:rPr>
+        <w:t>not</w:t>
+      </w:r>
+      <w:r>
+        <w:t xml:space="preserve"> going straight into:</w:t>
+      </w:r>
+    </w:p>
+    <w:p>
+      <w:r>
+        <w:t>AWS</w:t>
+      </w:r>
+    </w:p>
+    <w:p>
+      <w:r>
+        <w:t xml:space="preserve"> ↓</w:t>
+      </w:r>
+    </w:p>
+    <w:p>
+      <w:r>
+        <w:t>ECR</w:t>
+      </w:r>
+    </w:p>
+    <w:p>
+      <w:r>
+        <w:t xml:space="preserve"> ↓</w:t>
+      </w:r>
+    </w:p>
+    <w:p>
+      <w:r>
+        <w:t>ECS/Kubernetes</w:t>
+      </w:r>
+    </w:p>
+    <w:p>
+      <w:r>
+        <w:t xml:space="preserve"> ↓</w:t>
+      </w:r>
+    </w:p>
+    <w:p>
+      <w:r>
+        <w:t>Terraform</w:t>
+      </w:r>
+    </w:p>
+    <w:p>
+      <w:r>
+        <w:t xml:space="preserve"> ↓</w:t>
+      </w:r>
+    </w:p>
+    <w:p>
+      <w:r>
+        <w:t>Cloud deployment</w:t>
+      </w:r>
+    </w:p>
+    <w:p>
+      <w:r>
+        <w:t>That's a different layer.</w:t>
+      </w:r>
+    </w:p>
+    <w:p>
+      <w:r>
+        <w:t>For your current project, I want to establish:</w:t>
+      </w:r>
+    </w:p>
+    <w:p>
+      <w:r>
+        <w:rPr>
+          <w:b/>
+          <w:bCs/>
+        </w:rPr>
+        <w:t>ML → API → DB → Tests → Docker → CI</w:t>
+      </w:r>
+    </w:p>
+    <w:p>
+      <w:r>
+        <w:t>before introducing cloud infrastructure.</w:t>
+      </w:r>
+    </w:p>
+    <w:p>
+      <w:pPr>
+        <w:rPr>
+          <w:b/>
+          <w:bCs/>
+        </w:rPr>
+      </w:pPr>
+      <w:r>
+        <w:rPr>
+          <w:b/>
+          <w:bCs/>
+        </w:rPr>
+        <w:t>Then the project becomes much more interesting</w:t>
+      </w:r>
+    </w:p>
+    <w:p>
+      <w:r>
+        <w:t>Your current architecture:</w:t>
+      </w:r>
+    </w:p>
+    <w:p>
+      <w:r>
+        <w:t xml:space="preserve">                    GitHub</w:t>
+      </w:r>
+    </w:p>
+    <w:p>
+      <w:r>
+        <w:lastRenderedPageBreak/>
+        <w:t xml:space="preserve">                       │</w:t>
+      </w:r>
+    </w:p>
+    <w:p>
+      <w:r>
+        <w:t xml:space="preserve">                       </w:t>
+      </w:r>
+      <w:r>
+        <w:rPr>
+          <w:rFonts w:ascii="Arial" w:hAnsi="Arial" w:cs="Arial"/>
+        </w:rPr>
+        <w:t>▼</w:t>
+      </w:r>
+    </w:p>
+    <w:p>
+      <w:r>
+        <w:t xml:space="preserve">                 GitHub Actions</w:t>
+      </w:r>
+    </w:p>
+    <w:p>
+      <w:r>
+        <w:t xml:space="preserve">                 /            \</w:t>
+      </w:r>
+    </w:p>
+    <w:p>
+      <w:r>
+        <w:t xml:space="preserve">             </w:t>
+      </w:r>
+      <w:proofErr w:type="spellStart"/>
+      <w:r>
+        <w:t>pytest</w:t>
+      </w:r>
+      <w:proofErr w:type="spellEnd"/>
+      <w:r>
+        <w:t xml:space="preserve">       Docker build</w:t>
+      </w:r>
+    </w:p>
+    <w:p>
+      <w:r>
+        <w:t xml:space="preserve">                │               │</w:t>
+      </w:r>
+    </w:p>
+    <w:p>
+      <w:r>
+        <w:t xml:space="preserve">                └───────</w:t>
+      </w:r>
+      <w:r>
+        <w:rPr>
+          <w:rFonts w:ascii="MS Gothic" w:eastAsia="MS Gothic" w:hAnsi="MS Gothic" w:cs="MS Gothic" w:hint="eastAsia"/>
+        </w:rPr>
+        <w:t>┬</w:t>
+      </w:r>
+      <w:r>
+        <w:rPr>
+          <w:rFonts w:ascii="Aptos" w:hAnsi="Aptos" w:cs="Aptos"/>
+        </w:rPr>
+        <w:t>───────┘</w:t>
+      </w:r>
+    </w:p>
+    <w:p>
+      <w:r>
+        <w:t xml:space="preserve">                        </w:t>
+      </w:r>
+      <w:r>
+        <w:rPr>
+          <w:rFonts w:ascii="Arial" w:hAnsi="Arial" w:cs="Arial"/>
+        </w:rPr>
+        <w:t>▼</w:t>
+      </w:r>
+    </w:p>
+    <w:p>
+      <w:r>
+        <w:t xml:space="preserve">                 Credit Risk API</w:t>
+      </w:r>
+    </w:p>
+    <w:p>
+      <w:r>
+        <w:t xml:space="preserve">                  ┌───────────┐</w:t>
+      </w:r>
+    </w:p>
+    <w:p>
+      <w:r>
+        <w:t xml:space="preserve">                  </w:t>
+      </w:r>
+      <w:proofErr w:type="gramStart"/>
+      <w:r>
+        <w:t xml:space="preserve">│  </w:t>
+      </w:r>
+      <w:proofErr w:type="spellStart"/>
+      <w:r>
+        <w:t>FastAPI</w:t>
+      </w:r>
+      <w:proofErr w:type="spellEnd"/>
+      <w:proofErr w:type="gramEnd"/>
+      <w:r>
+        <w:t xml:space="preserve">  │</w:t>
+      </w:r>
+    </w:p>
+    <w:p>
+      <w:r>
+        <w:t xml:space="preserve">                  │ ML </w:t>
+      </w:r>
+      <w:proofErr w:type="gramStart"/>
+      <w:r>
+        <w:t>Model  │</w:t>
+      </w:r>
+      <w:proofErr w:type="gramEnd"/>
+    </w:p>
+    <w:p>
+      <w:r>
+        <w:t xml:space="preserve">                  └─────</w:t>
+      </w:r>
+      <w:r>
+        <w:rPr>
+          <w:rFonts w:ascii="MS Gothic" w:eastAsia="MS Gothic" w:hAnsi="MS Gothic" w:cs="MS Gothic" w:hint="eastAsia"/>
+        </w:rPr>
+        <w:t>┬</w:t>
+      </w:r>
+      <w:r>
+        <w:rPr>
+          <w:rFonts w:ascii="Aptos" w:hAnsi="Aptos" w:cs="Aptos"/>
+        </w:rPr>
+        <w:t>─────┘</w:t>
+      </w:r>
+    </w:p>
+    <w:p>
+      <w:r>
+        <w:t xml:space="preserve">                        │</w:t>
+      </w:r>
+    </w:p>
+    <w:p>
+      <w:r>
+        <w:t xml:space="preserve">                        </w:t>
+      </w:r>
+      <w:r>
+        <w:rPr>
+          <w:rFonts w:ascii="Arial" w:hAnsi="Arial" w:cs="Arial"/>
+        </w:rPr>
+        <w:t>▼</w:t>
+      </w:r>
+    </w:p>
+    <w:p>
+      <w:r>
+        <w:t xml:space="preserve">                  PostgreSQL</w:t>
+      </w:r>
+    </w:p>
+    <w:p>
+      <w:r>
+        <w:rPr>
+          <w:b/>
+          <w:bCs/>
+        </w:rPr>
+        <w:t>That's the layer I'd build next.</w:t>
+      </w:r>
+    </w:p>
+    <w:p>
+      <w:r>
+        <w:t xml:space="preserve">And we can do it incrementally—probably </w:t>
+      </w:r>
+      <w:r>
+        <w:rPr>
+          <w:b/>
+          <w:bCs/>
+        </w:rPr>
+        <w:t xml:space="preserve">one </w:t>
+      </w:r>
+      <w:proofErr w:type="spellStart"/>
+      <w:r>
+        <w:rPr>
+          <w:b/>
+          <w:bCs/>
+        </w:rPr>
+        <w:t>ci.yml</w:t>
+      </w:r>
+      <w:proofErr w:type="spellEnd"/>
+      <w:r>
+        <w:rPr>
+          <w:b/>
+          <w:bCs/>
+        </w:rPr>
+        <w:t xml:space="preserve"> file + a small dependency adjustment</w:t>
+      </w:r>
+      <w:r>
+        <w:t>, not a massive rewrite of your project.</w:t>
       </w:r>
     </w:p>
     <w:p/>
@@ -14767,9 +15544,9 @@
 <file path=word/numbering.xml><?xml version="1.0" encoding="utf-8"?>
 <w:numbering xmlns:wpc="http://schemas.microsoft.com/office/word/2010/wordprocessingCanvas" xmlns:cx="http://schemas.microsoft.com/office/drawing/2014/chartex" xmlns:cx1="http://schemas.microsoft.com/office/drawing/2015/9/8/chartex" xmlns:cx2="http://schemas.microsoft.com/office/drawing/2015/10/21/chartex" xmlns:cx3="http://schemas.microsoft.com/office/drawing/2016/5/9/chartex" xmlns:cx4="http://schemas.microsoft.com/office/drawing/2016/5/10/chartex" xmlns:cx5="http://schemas.microsoft.com/office/drawing/2016/5/11/chartex" xmlns:cx6="http://schemas.microsoft.com/office/drawing/2016/5/12/chartex" xmlns:cx7="http://schemas.microsoft.com/office/drawing/2016/5/13/chartex" xmlns:cx8="http://schemas.microsoft.com/office/drawing/2016/5/14/chartex" xmlns:mc="http://schemas.openxmlformats.org/markup-compatibility/2006" xmlns:aink="http://schemas.microsoft.com/office/drawing/2016/ink" xmlns:am3d="http://schemas.microsoft.com/office/drawing/2017/model3d" xmlns:o="urn:schemas-microsoft-com:office:office" xmlns:oel="http://schemas.microsoft.com/office/2019/extlst" xmlns:r="http://schemas.openxmlformats.org/officeDocument/2006/relationships" xmlns:m="http://schemas.openxmlformats.org/officeDocument/2006/math" xmlns:v="urn:schemas-microsoft-com:vml" xmlns:wp14="http://schemas.microsoft.com/office/word/2010/wordprocessingDrawing" xmlns:wp="http://schemas.openxmlformats.org/drawingml/2006/wordprocessingDrawing" xmlns:w10="urn:schemas-microsoft-com:office:word" xmlns:w="http://schemas.openxmlformats.org/wordprocessingml/2006/main" xmlns:w14="http://schemas.microsoft.com/office/word/2010/wordml" xmlns:w15="http://schemas.microsoft.com/office/word/2012/wordml" xmlns:w16cex="http://schemas.microsoft.com/office/word/2018/wordml/cex" xmlns:w16cid="http://schemas.microsoft.com/office/word/2016/wordml/cid" xmlns:w16="http://schemas.microsoft.com/office/word/2018/wordml" xmlns:w16du="http://schemas.microsoft.com/office/word/2023/wordml/word16du" xmlns:w16sdtdh="http://schemas.microsoft.com/office/word/2020/wordml/sdtdatahash" xmlns:w16sdtfl="http://schemas.microsoft.com/office/word/2024/wordml/sdtformatlock" xmlns:w16se="http://schemas.microsoft.com/office/word/2015/wordml/symex" xmlns:wpg="http://schemas.microsoft.com/office/word/2010/wordprocessingGroup" xmlns:wpi="http://schemas.microsoft.com/office/word/2010/wordprocessingInk" xmlns:wne="http://schemas.microsoft.com/office/word/2006/wordml" xmlns:wps="http://schemas.microsoft.com/office/word/2010/wordprocessingShape" mc:Ignorable="w14 w15 w16se w16cid w16 w16cex w16sdtdh w16sdtfl w16du wp14">
   <w:abstractNum w:abstractNumId="0" w15:restartNumberingAfterBreak="0">
-    <w:nsid w:val="19C67159"/>
+    <w:nsid w:val="02731AD7"/>
     <w:multiLevelType w:val="multilevel"/>
-    <w:tmpl w:val="4C90C62E"/>
+    <w:tmpl w:val="DA8A8602"/>
     <w:lvl w:ilvl="0">
       <w:start w:val="1"/>
       <w:numFmt w:val="bullet"/>
@@ -14916,208 +15693,9 @@
     </w:lvl>
   </w:abstractNum>
   <w:abstractNum w:abstractNumId="1" w15:restartNumberingAfterBreak="0">
-    <w:nsid w:val="1DFD25CA"/>
-    <w:multiLevelType w:val="hybridMultilevel"/>
-    <w:tmpl w:val="D4BA603A"/>
-    <w:lvl w:ilvl="0" w:tplc="04090001">
-      <w:start w:val="1"/>
-      <w:numFmt w:val="bullet"/>
-      <w:lvlText w:val=""/>
-      <w:lvlJc w:val="left"/>
-      <w:pPr>
-        <w:ind w:left="1440" w:hanging="360"/>
-      </w:pPr>
-      <w:rPr>
-        <w:rFonts w:ascii="Symbol" w:hAnsi="Symbol" w:hint="default"/>
-      </w:rPr>
-    </w:lvl>
-    <w:lvl w:ilvl="1" w:tplc="04090003" w:tentative="1">
-      <w:start w:val="1"/>
-      <w:numFmt w:val="bullet"/>
-      <w:lvlText w:val="o"/>
-      <w:lvlJc w:val="left"/>
-      <w:pPr>
-        <w:ind w:left="2160" w:hanging="360"/>
-      </w:pPr>
-      <w:rPr>
-        <w:rFonts w:ascii="Courier New" w:hAnsi="Courier New" w:cs="Courier New" w:hint="default"/>
-      </w:rPr>
-    </w:lvl>
-    <w:lvl w:ilvl="2" w:tplc="04090005" w:tentative="1">
-      <w:start w:val="1"/>
-      <w:numFmt w:val="bullet"/>
-      <w:lvlText w:val=""/>
-      <w:lvlJc w:val="left"/>
-      <w:pPr>
-        <w:ind w:left="2880" w:hanging="360"/>
-      </w:pPr>
-      <w:rPr>
-        <w:rFonts w:ascii="Wingdings" w:hAnsi="Wingdings" w:hint="default"/>
-      </w:rPr>
-    </w:lvl>
-    <w:lvl w:ilvl="3" w:tplc="04090001" w:tentative="1">
-      <w:start w:val="1"/>
-      <w:numFmt w:val="bullet"/>
-      <w:lvlText w:val=""/>
-      <w:lvlJc w:val="left"/>
-      <w:pPr>
-        <w:ind w:left="3600" w:hanging="360"/>
-      </w:pPr>
-      <w:rPr>
-        <w:rFonts w:ascii="Symbol" w:hAnsi="Symbol" w:hint="default"/>
-      </w:rPr>
-    </w:lvl>
-    <w:lvl w:ilvl="4" w:tplc="04090003" w:tentative="1">
-      <w:start w:val="1"/>
-      <w:numFmt w:val="bullet"/>
-      <w:lvlText w:val="o"/>
-      <w:lvlJc w:val="left"/>
-      <w:pPr>
-        <w:ind w:left="4320" w:hanging="360"/>
-      </w:pPr>
-      <w:rPr>
-        <w:rFonts w:ascii="Courier New" w:hAnsi="Courier New" w:cs="Courier New" w:hint="default"/>
-      </w:rPr>
-    </w:lvl>
-    <w:lvl w:ilvl="5" w:tplc="04090005" w:tentative="1">
-      <w:start w:val="1"/>
-      <w:numFmt w:val="bullet"/>
-      <w:lvlText w:val=""/>
-      <w:lvlJc w:val="left"/>
-      <w:pPr>
-        <w:ind w:left="5040" w:hanging="360"/>
-      </w:pPr>
-      <w:rPr>
-        <w:rFonts w:ascii="Wingdings" w:hAnsi="Wingdings" w:hint="default"/>
-      </w:rPr>
-    </w:lvl>
-    <w:lvl w:ilvl="6" w:tplc="04090001" w:tentative="1">
-      <w:start w:val="1"/>
-      <w:numFmt w:val="bullet"/>
-      <w:lvlText w:val=""/>
-      <w:lvlJc w:val="left"/>
-      <w:pPr>
-        <w:ind w:left="5760" w:hanging="360"/>
-      </w:pPr>
-      <w:rPr>
-        <w:rFonts w:ascii="Symbol" w:hAnsi="Symbol" w:hint="default"/>
-      </w:rPr>
-    </w:lvl>
-    <w:lvl w:ilvl="7" w:tplc="04090003" w:tentative="1">
-      <w:start w:val="1"/>
-      <w:numFmt w:val="bullet"/>
-      <w:lvlText w:val="o"/>
-      <w:lvlJc w:val="left"/>
-      <w:pPr>
-        <w:ind w:left="6480" w:hanging="360"/>
-      </w:pPr>
-      <w:rPr>
-        <w:rFonts w:ascii="Courier New" w:hAnsi="Courier New" w:cs="Courier New" w:hint="default"/>
-      </w:rPr>
-    </w:lvl>
-    <w:lvl w:ilvl="8" w:tplc="04090005" w:tentative="1">
-      <w:start w:val="1"/>
-      <w:numFmt w:val="bullet"/>
-      <w:lvlText w:val=""/>
-      <w:lvlJc w:val="left"/>
-      <w:pPr>
-        <w:ind w:left="7200" w:hanging="360"/>
-      </w:pPr>
-      <w:rPr>
-        <w:rFonts w:ascii="Wingdings" w:hAnsi="Wingdings" w:hint="default"/>
-      </w:rPr>
-    </w:lvl>
-  </w:abstractNum>
-  <w:abstractNum w:abstractNumId="2" w15:restartNumberingAfterBreak="0">
-    <w:nsid w:val="21503E41"/>
-    <w:multiLevelType w:val="hybridMultilevel"/>
-    <w:tmpl w:val="EAB26DAA"/>
-    <w:lvl w:ilvl="0" w:tplc="0409000F">
-      <w:start w:val="1"/>
-      <w:numFmt w:val="decimal"/>
-      <w:lvlText w:val="%1."/>
-      <w:lvlJc w:val="left"/>
-      <w:pPr>
-        <w:ind w:left="720" w:hanging="360"/>
-      </w:pPr>
-    </w:lvl>
-    <w:lvl w:ilvl="1" w:tplc="04090019" w:tentative="1">
-      <w:start w:val="1"/>
-      <w:numFmt w:val="lowerLetter"/>
-      <w:lvlText w:val="%2."/>
-      <w:lvlJc w:val="left"/>
-      <w:pPr>
-        <w:ind w:left="1440" w:hanging="360"/>
-      </w:pPr>
-    </w:lvl>
-    <w:lvl w:ilvl="2" w:tplc="0409001B" w:tentative="1">
-      <w:start w:val="1"/>
-      <w:numFmt w:val="lowerRoman"/>
-      <w:lvlText w:val="%3."/>
-      <w:lvlJc w:val="right"/>
-      <w:pPr>
-        <w:ind w:left="2160" w:hanging="180"/>
-      </w:pPr>
-    </w:lvl>
-    <w:lvl w:ilvl="3" w:tplc="0409000F" w:tentative="1">
-      <w:start w:val="1"/>
-      <w:numFmt w:val="decimal"/>
-      <w:lvlText w:val="%4."/>
-      <w:lvlJc w:val="left"/>
-      <w:pPr>
-        <w:ind w:left="2880" w:hanging="360"/>
-      </w:pPr>
-    </w:lvl>
-    <w:lvl w:ilvl="4" w:tplc="04090019" w:tentative="1">
-      <w:start w:val="1"/>
-      <w:numFmt w:val="lowerLetter"/>
-      <w:lvlText w:val="%5."/>
-      <w:lvlJc w:val="left"/>
-      <w:pPr>
-        <w:ind w:left="3600" w:hanging="360"/>
-      </w:pPr>
-    </w:lvl>
-    <w:lvl w:ilvl="5" w:tplc="0409001B" w:tentative="1">
-      <w:start w:val="1"/>
-      <w:numFmt w:val="lowerRoman"/>
-      <w:lvlText w:val="%6."/>
-      <w:lvlJc w:val="right"/>
-      <w:pPr>
-        <w:ind w:left="4320" w:hanging="180"/>
-      </w:pPr>
-    </w:lvl>
-    <w:lvl w:ilvl="6" w:tplc="0409000F" w:tentative="1">
-      <w:start w:val="1"/>
-      <w:numFmt w:val="decimal"/>
-      <w:lvlText w:val="%7."/>
-      <w:lvlJc w:val="left"/>
-      <w:pPr>
-        <w:ind w:left="5040" w:hanging="360"/>
-      </w:pPr>
-    </w:lvl>
-    <w:lvl w:ilvl="7" w:tplc="04090019" w:tentative="1">
-      <w:start w:val="1"/>
-      <w:numFmt w:val="lowerLetter"/>
-      <w:lvlText w:val="%8."/>
-      <w:lvlJc w:val="left"/>
-      <w:pPr>
-        <w:ind w:left="5760" w:hanging="360"/>
-      </w:pPr>
-    </w:lvl>
-    <w:lvl w:ilvl="8" w:tplc="0409001B" w:tentative="1">
-      <w:start w:val="1"/>
-      <w:numFmt w:val="lowerRoman"/>
-      <w:lvlText w:val="%9."/>
-      <w:lvlJc w:val="right"/>
-      <w:pPr>
-        <w:ind w:left="6480" w:hanging="180"/>
-      </w:pPr>
-    </w:lvl>
-  </w:abstractNum>
-  <w:abstractNum w:abstractNumId="3" w15:restartNumberingAfterBreak="0">
-    <w:nsid w:val="4DF32531"/>
+    <w:nsid w:val="19C67159"/>
     <w:multiLevelType w:val="multilevel"/>
-    <w:tmpl w:val="E58269B8"/>
+    <w:tmpl w:val="4C90C62E"/>
     <w:lvl w:ilvl="0">
       <w:start w:val="1"/>
       <w:numFmt w:val="bullet"/>
@@ -15263,10 +15841,10 @@
       </w:rPr>
     </w:lvl>
   </w:abstractNum>
-  <w:abstractNum w:abstractNumId="4" w15:restartNumberingAfterBreak="0">
-    <w:nsid w:val="4FBB0C7C"/>
+  <w:abstractNum w:abstractNumId="2" w15:restartNumberingAfterBreak="0">
+    <w:nsid w:val="1DFD25CA"/>
     <w:multiLevelType w:val="hybridMultilevel"/>
-    <w:tmpl w:val="2E9C6E52"/>
+    <w:tmpl w:val="D4BA603A"/>
     <w:lvl w:ilvl="0" w:tplc="04090001">
       <w:start w:val="1"/>
       <w:numFmt w:val="bullet"/>
@@ -15376,7 +15954,355 @@
       </w:rPr>
     </w:lvl>
   </w:abstractNum>
+  <w:abstractNum w:abstractNumId="3" w15:restartNumberingAfterBreak="0">
+    <w:nsid w:val="21503E41"/>
+    <w:multiLevelType w:val="hybridMultilevel"/>
+    <w:tmpl w:val="EAB26DAA"/>
+    <w:lvl w:ilvl="0" w:tplc="0409000F">
+      <w:start w:val="1"/>
+      <w:numFmt w:val="decimal"/>
+      <w:lvlText w:val="%1."/>
+      <w:lvlJc w:val="left"/>
+      <w:pPr>
+        <w:ind w:left="720" w:hanging="360"/>
+      </w:pPr>
+    </w:lvl>
+    <w:lvl w:ilvl="1" w:tplc="04090019" w:tentative="1">
+      <w:start w:val="1"/>
+      <w:numFmt w:val="lowerLetter"/>
+      <w:lvlText w:val="%2."/>
+      <w:lvlJc w:val="left"/>
+      <w:pPr>
+        <w:ind w:left="1440" w:hanging="360"/>
+      </w:pPr>
+    </w:lvl>
+    <w:lvl w:ilvl="2" w:tplc="0409001B" w:tentative="1">
+      <w:start w:val="1"/>
+      <w:numFmt w:val="lowerRoman"/>
+      <w:lvlText w:val="%3."/>
+      <w:lvlJc w:val="right"/>
+      <w:pPr>
+        <w:ind w:left="2160" w:hanging="180"/>
+      </w:pPr>
+    </w:lvl>
+    <w:lvl w:ilvl="3" w:tplc="0409000F" w:tentative="1">
+      <w:start w:val="1"/>
+      <w:numFmt w:val="decimal"/>
+      <w:lvlText w:val="%4."/>
+      <w:lvlJc w:val="left"/>
+      <w:pPr>
+        <w:ind w:left="2880" w:hanging="360"/>
+      </w:pPr>
+    </w:lvl>
+    <w:lvl w:ilvl="4" w:tplc="04090019" w:tentative="1">
+      <w:start w:val="1"/>
+      <w:numFmt w:val="lowerLetter"/>
+      <w:lvlText w:val="%5."/>
+      <w:lvlJc w:val="left"/>
+      <w:pPr>
+        <w:ind w:left="3600" w:hanging="360"/>
+      </w:pPr>
+    </w:lvl>
+    <w:lvl w:ilvl="5" w:tplc="0409001B" w:tentative="1">
+      <w:start w:val="1"/>
+      <w:numFmt w:val="lowerRoman"/>
+      <w:lvlText w:val="%6."/>
+      <w:lvlJc w:val="right"/>
+      <w:pPr>
+        <w:ind w:left="4320" w:hanging="180"/>
+      </w:pPr>
+    </w:lvl>
+    <w:lvl w:ilvl="6" w:tplc="0409000F" w:tentative="1">
+      <w:start w:val="1"/>
+      <w:numFmt w:val="decimal"/>
+      <w:lvlText w:val="%7."/>
+      <w:lvlJc w:val="left"/>
+      <w:pPr>
+        <w:ind w:left="5040" w:hanging="360"/>
+      </w:pPr>
+    </w:lvl>
+    <w:lvl w:ilvl="7" w:tplc="04090019" w:tentative="1">
+      <w:start w:val="1"/>
+      <w:numFmt w:val="lowerLetter"/>
+      <w:lvlText w:val="%8."/>
+      <w:lvlJc w:val="left"/>
+      <w:pPr>
+        <w:ind w:left="5760" w:hanging="360"/>
+      </w:pPr>
+    </w:lvl>
+    <w:lvl w:ilvl="8" w:tplc="0409001B" w:tentative="1">
+      <w:start w:val="1"/>
+      <w:numFmt w:val="lowerRoman"/>
+      <w:lvlText w:val="%9."/>
+      <w:lvlJc w:val="right"/>
+      <w:pPr>
+        <w:ind w:left="6480" w:hanging="180"/>
+      </w:pPr>
+    </w:lvl>
+  </w:abstractNum>
+  <w:abstractNum w:abstractNumId="4" w15:restartNumberingAfterBreak="0">
+    <w:nsid w:val="4DF32531"/>
+    <w:multiLevelType w:val="multilevel"/>
+    <w:tmpl w:val="E58269B8"/>
+    <w:lvl w:ilvl="0">
+      <w:start w:val="1"/>
+      <w:numFmt w:val="bullet"/>
+      <w:lvlText w:val=""/>
+      <w:lvlJc w:val="left"/>
+      <w:pPr>
+        <w:tabs>
+          <w:tab w:val="num" w:pos="720"/>
+        </w:tabs>
+        <w:ind w:left="720" w:hanging="360"/>
+      </w:pPr>
+      <w:rPr>
+        <w:rFonts w:ascii="Symbol" w:hAnsi="Symbol" w:hint="default"/>
+        <w:sz w:val="20"/>
+      </w:rPr>
+    </w:lvl>
+    <w:lvl w:ilvl="1" w:tentative="1">
+      <w:start w:val="1"/>
+      <w:numFmt w:val="bullet"/>
+      <w:lvlText w:val="o"/>
+      <w:lvlJc w:val="left"/>
+      <w:pPr>
+        <w:tabs>
+          <w:tab w:val="num" w:pos="1440"/>
+        </w:tabs>
+        <w:ind w:left="1440" w:hanging="360"/>
+      </w:pPr>
+      <w:rPr>
+        <w:rFonts w:ascii="Courier New" w:hAnsi="Courier New" w:hint="default"/>
+        <w:sz w:val="20"/>
+      </w:rPr>
+    </w:lvl>
+    <w:lvl w:ilvl="2" w:tentative="1">
+      <w:start w:val="1"/>
+      <w:numFmt w:val="bullet"/>
+      <w:lvlText w:val=""/>
+      <w:lvlJc w:val="left"/>
+      <w:pPr>
+        <w:tabs>
+          <w:tab w:val="num" w:pos="2160"/>
+        </w:tabs>
+        <w:ind w:left="2160" w:hanging="360"/>
+      </w:pPr>
+      <w:rPr>
+        <w:rFonts w:ascii="Wingdings" w:hAnsi="Wingdings" w:hint="default"/>
+        <w:sz w:val="20"/>
+      </w:rPr>
+    </w:lvl>
+    <w:lvl w:ilvl="3" w:tentative="1">
+      <w:start w:val="1"/>
+      <w:numFmt w:val="bullet"/>
+      <w:lvlText w:val=""/>
+      <w:lvlJc w:val="left"/>
+      <w:pPr>
+        <w:tabs>
+          <w:tab w:val="num" w:pos="2880"/>
+        </w:tabs>
+        <w:ind w:left="2880" w:hanging="360"/>
+      </w:pPr>
+      <w:rPr>
+        <w:rFonts w:ascii="Wingdings" w:hAnsi="Wingdings" w:hint="default"/>
+        <w:sz w:val="20"/>
+      </w:rPr>
+    </w:lvl>
+    <w:lvl w:ilvl="4" w:tentative="1">
+      <w:start w:val="1"/>
+      <w:numFmt w:val="bullet"/>
+      <w:lvlText w:val=""/>
+      <w:lvlJc w:val="left"/>
+      <w:pPr>
+        <w:tabs>
+          <w:tab w:val="num" w:pos="3600"/>
+        </w:tabs>
+        <w:ind w:left="3600" w:hanging="360"/>
+      </w:pPr>
+      <w:rPr>
+        <w:rFonts w:ascii="Wingdings" w:hAnsi="Wingdings" w:hint="default"/>
+        <w:sz w:val="20"/>
+      </w:rPr>
+    </w:lvl>
+    <w:lvl w:ilvl="5" w:tentative="1">
+      <w:start w:val="1"/>
+      <w:numFmt w:val="bullet"/>
+      <w:lvlText w:val=""/>
+      <w:lvlJc w:val="left"/>
+      <w:pPr>
+        <w:tabs>
+          <w:tab w:val="num" w:pos="4320"/>
+        </w:tabs>
+        <w:ind w:left="4320" w:hanging="360"/>
+      </w:pPr>
+      <w:rPr>
+        <w:rFonts w:ascii="Wingdings" w:hAnsi="Wingdings" w:hint="default"/>
+        <w:sz w:val="20"/>
+      </w:rPr>
+    </w:lvl>
+    <w:lvl w:ilvl="6" w:tentative="1">
+      <w:start w:val="1"/>
+      <w:numFmt w:val="bullet"/>
+      <w:lvlText w:val=""/>
+      <w:lvlJc w:val="left"/>
+      <w:pPr>
+        <w:tabs>
+          <w:tab w:val="num" w:pos="5040"/>
+        </w:tabs>
+        <w:ind w:left="5040" w:hanging="360"/>
+      </w:pPr>
+      <w:rPr>
+        <w:rFonts w:ascii="Wingdings" w:hAnsi="Wingdings" w:hint="default"/>
+        <w:sz w:val="20"/>
+      </w:rPr>
+    </w:lvl>
+    <w:lvl w:ilvl="7" w:tentative="1">
+      <w:start w:val="1"/>
+      <w:numFmt w:val="bullet"/>
+      <w:lvlText w:val=""/>
+      <w:lvlJc w:val="left"/>
+      <w:pPr>
+        <w:tabs>
+          <w:tab w:val="num" w:pos="5760"/>
+        </w:tabs>
+        <w:ind w:left="5760" w:hanging="360"/>
+      </w:pPr>
+      <w:rPr>
+        <w:rFonts w:ascii="Wingdings" w:hAnsi="Wingdings" w:hint="default"/>
+        <w:sz w:val="20"/>
+      </w:rPr>
+    </w:lvl>
+    <w:lvl w:ilvl="8" w:tentative="1">
+      <w:start w:val="1"/>
+      <w:numFmt w:val="bullet"/>
+      <w:lvlText w:val=""/>
+      <w:lvlJc w:val="left"/>
+      <w:pPr>
+        <w:tabs>
+          <w:tab w:val="num" w:pos="6480"/>
+        </w:tabs>
+        <w:ind w:left="6480" w:hanging="360"/>
+      </w:pPr>
+      <w:rPr>
+        <w:rFonts w:ascii="Wingdings" w:hAnsi="Wingdings" w:hint="default"/>
+        <w:sz w:val="20"/>
+      </w:rPr>
+    </w:lvl>
+  </w:abstractNum>
   <w:abstractNum w:abstractNumId="5" w15:restartNumberingAfterBreak="0">
+    <w:nsid w:val="4FBB0C7C"/>
+    <w:multiLevelType w:val="hybridMultilevel"/>
+    <w:tmpl w:val="2E9C6E52"/>
+    <w:lvl w:ilvl="0" w:tplc="04090001">
+      <w:start w:val="1"/>
+      <w:numFmt w:val="bullet"/>
+      <w:lvlText w:val=""/>
+      <w:lvlJc w:val="left"/>
+      <w:pPr>
+        <w:ind w:left="1440" w:hanging="360"/>
+      </w:pPr>
+      <w:rPr>
+        <w:rFonts w:ascii="Symbol" w:hAnsi="Symbol" w:hint="default"/>
+      </w:rPr>
+    </w:lvl>
+    <w:lvl w:ilvl="1" w:tplc="04090003" w:tentative="1">
+      <w:start w:val="1"/>
+      <w:numFmt w:val="bullet"/>
+      <w:lvlText w:val="o"/>
+      <w:lvlJc w:val="left"/>
+      <w:pPr>
+        <w:ind w:left="2160" w:hanging="360"/>
+      </w:pPr>
+      <w:rPr>
+        <w:rFonts w:ascii="Courier New" w:hAnsi="Courier New" w:cs="Courier New" w:hint="default"/>
+      </w:rPr>
+    </w:lvl>
+    <w:lvl w:ilvl="2" w:tplc="04090005" w:tentative="1">
+      <w:start w:val="1"/>
+      <w:numFmt w:val="bullet"/>
+      <w:lvlText w:val=""/>
+      <w:lvlJc w:val="left"/>
+      <w:pPr>
+        <w:ind w:left="2880" w:hanging="360"/>
+      </w:pPr>
+      <w:rPr>
+        <w:rFonts w:ascii="Wingdings" w:hAnsi="Wingdings" w:hint="default"/>
+      </w:rPr>
+    </w:lvl>
+    <w:lvl w:ilvl="3" w:tplc="04090001" w:tentative="1">
+      <w:start w:val="1"/>
+      <w:numFmt w:val="bullet"/>
+      <w:lvlText w:val=""/>
+      <w:lvlJc w:val="left"/>
+      <w:pPr>
+        <w:ind w:left="3600" w:hanging="360"/>
+      </w:pPr>
+      <w:rPr>
+        <w:rFonts w:ascii="Symbol" w:hAnsi="Symbol" w:hint="default"/>
+      </w:rPr>
+    </w:lvl>
+    <w:lvl w:ilvl="4" w:tplc="04090003" w:tentative="1">
+      <w:start w:val="1"/>
+      <w:numFmt w:val="bullet"/>
+      <w:lvlText w:val="o"/>
+      <w:lvlJc w:val="left"/>
+      <w:pPr>
+        <w:ind w:left="4320" w:hanging="360"/>
+      </w:pPr>
+      <w:rPr>
+        <w:rFonts w:ascii="Courier New" w:hAnsi="Courier New" w:cs="Courier New" w:hint="default"/>
+      </w:rPr>
+    </w:lvl>
+    <w:lvl w:ilvl="5" w:tplc="04090005" w:tentative="1">
+      <w:start w:val="1"/>
+      <w:numFmt w:val="bullet"/>
+      <w:lvlText w:val=""/>
+      <w:lvlJc w:val="left"/>
+      <w:pPr>
+        <w:ind w:left="5040" w:hanging="360"/>
+      </w:pPr>
+      <w:rPr>
+        <w:rFonts w:ascii="Wingdings" w:hAnsi="Wingdings" w:hint="default"/>
+      </w:rPr>
+    </w:lvl>
+    <w:lvl w:ilvl="6" w:tplc="04090001" w:tentative="1">
+      <w:start w:val="1"/>
+      <w:numFmt w:val="bullet"/>
+      <w:lvlText w:val=""/>
+      <w:lvlJc w:val="left"/>
+      <w:pPr>
+        <w:ind w:left="5760" w:hanging="360"/>
+      </w:pPr>
+      <w:rPr>
+        <w:rFonts w:ascii="Symbol" w:hAnsi="Symbol" w:hint="default"/>
+      </w:rPr>
+    </w:lvl>
+    <w:lvl w:ilvl="7" w:tplc="04090003" w:tentative="1">
+      <w:start w:val="1"/>
+      <w:numFmt w:val="bullet"/>
+      <w:lvlText w:val="o"/>
+      <w:lvlJc w:val="left"/>
+      <w:pPr>
+        <w:ind w:left="6480" w:hanging="360"/>
+      </w:pPr>
+      <w:rPr>
+        <w:rFonts w:ascii="Courier New" w:hAnsi="Courier New" w:cs="Courier New" w:hint="default"/>
+      </w:rPr>
+    </w:lvl>
+    <w:lvl w:ilvl="8" w:tplc="04090005" w:tentative="1">
+      <w:start w:val="1"/>
+      <w:numFmt w:val="bullet"/>
+      <w:lvlText w:val=""/>
+      <w:lvlJc w:val="left"/>
+      <w:pPr>
+        <w:ind w:left="7200" w:hanging="360"/>
+      </w:pPr>
+      <w:rPr>
+        <w:rFonts w:ascii="Wingdings" w:hAnsi="Wingdings" w:hint="default"/>
+      </w:rPr>
+    </w:lvl>
+  </w:abstractNum>
+  <w:abstractNum w:abstractNumId="6" w15:restartNumberingAfterBreak="0">
     <w:nsid w:val="6A115FF4"/>
     <w:multiLevelType w:val="multilevel"/>
     <w:tmpl w:val="A0F2D55C"/>
@@ -15525,7 +16451,7 @@
       </w:rPr>
     </w:lvl>
   </w:abstractNum>
-  <w:abstractNum w:abstractNumId="6" w15:restartNumberingAfterBreak="0">
+  <w:abstractNum w:abstractNumId="7" w15:restartNumberingAfterBreak="0">
     <w:nsid w:val="6D83120D"/>
     <w:multiLevelType w:val="hybridMultilevel"/>
     <w:tmpl w:val="012AFB9C"/>
@@ -15614,7 +16540,7 @@
       </w:pPr>
     </w:lvl>
   </w:abstractNum>
-  <w:abstractNum w:abstractNumId="7" w15:restartNumberingAfterBreak="0">
+  <w:abstractNum w:abstractNumId="8" w15:restartNumberingAfterBreak="0">
     <w:nsid w:val="74B335C9"/>
     <w:multiLevelType w:val="multilevel"/>
     <w:tmpl w:val="5CE05836"/>
@@ -15764,28 +16690,31 @@
     </w:lvl>
   </w:abstractNum>
   <w:num w:numId="1" w16cid:durableId="1987778007">
+    <w:abstractNumId w:val="7"/>
+  </w:num>
+  <w:num w:numId="2" w16cid:durableId="590700083">
+    <w:abstractNumId w:val="3"/>
+  </w:num>
+  <w:num w:numId="3" w16cid:durableId="1194923529">
+    <w:abstractNumId w:val="8"/>
+  </w:num>
+  <w:num w:numId="4" w16cid:durableId="1369795390">
     <w:abstractNumId w:val="6"/>
   </w:num>
-  <w:num w:numId="2" w16cid:durableId="590700083">
+  <w:num w:numId="5" w16cid:durableId="366150693">
     <w:abstractNumId w:val="2"/>
   </w:num>
-  <w:num w:numId="3" w16cid:durableId="1194923529">
-    <w:abstractNumId w:val="7"/>
-  </w:num>
-  <w:num w:numId="4" w16cid:durableId="1369795390">
+  <w:num w:numId="6" w16cid:durableId="668023593">
     <w:abstractNumId w:val="5"/>
   </w:num>
-  <w:num w:numId="5" w16cid:durableId="366150693">
+  <w:num w:numId="7" w16cid:durableId="648367130">
     <w:abstractNumId w:val="1"/>
   </w:num>
-  <w:num w:numId="6" w16cid:durableId="668023593">
+  <w:num w:numId="8" w16cid:durableId="665859634">
     <w:abstractNumId w:val="4"/>
   </w:num>
-  <w:num w:numId="7" w16cid:durableId="648367130">
+  <w:num w:numId="9" w16cid:durableId="1337805141">
     <w:abstractNumId w:val="0"/>
-  </w:num>
-  <w:num w:numId="8" w16cid:durableId="665859634">
-    <w:abstractNumId w:val="3"/>
   </w:num>
 </w:numbering>
 </file>

</xml_diff>